<commit_message>
working with claud to restructure program
</commit_message>
<xml_diff>
--- a/docs/source/dataPreparation/DataPreparation.docx
+++ b/docs/source/dataPreparation/DataPreparation.docx
@@ -1,6 +1,6 @@
 
 <file path=word/document.xml><?xml version="1.0" encoding="utf-8"?>
-<w:document xmlns:wpc="http://schemas.microsoft.com/office/word/2010/wordprocessingCanvas" xmlns:cx="http://schemas.microsoft.com/office/drawing/2014/chartex" xmlns:cx1="http://schemas.microsoft.com/office/drawing/2015/9/8/chartex" xmlns:cx2="http://schemas.microsoft.com/office/drawing/2015/10/21/chartex" xmlns:cx3="http://schemas.microsoft.com/office/drawing/2016/5/9/chartex" xmlns:cx4="http://schemas.microsoft.com/office/drawing/2016/5/10/chartex" xmlns:cx5="http://schemas.microsoft.com/office/drawing/2016/5/11/chartex" xmlns:cx6="http://schemas.microsoft.com/office/drawing/2016/5/12/chartex" xmlns:cx7="http://schemas.microsoft.com/office/drawing/2016/5/13/chartex" xmlns:cx8="http://schemas.microsoft.com/office/drawing/2016/5/14/chartex" xmlns:mc="http://schemas.openxmlformats.org/markup-compatibility/2006" xmlns:aink="http://schemas.microsoft.com/office/drawing/2016/ink" xmlns:am3d="http://schemas.microsoft.com/office/drawing/2017/model3d" xmlns:o="urn:schemas-microsoft-com:office:office" xmlns:oel="http://schemas.microsoft.com/office/2019/extlst" xmlns:r="http://schemas.openxmlformats.org/officeDocument/2006/relationships" xmlns:m="http://schemas.openxmlformats.org/officeDocument/2006/math" xmlns:v="urn:schemas-microsoft-com:vml" xmlns:wp14="http://schemas.microsoft.com/office/word/2010/wordprocessingDrawing" xmlns:wp="http://schemas.openxmlformats.org/drawingml/2006/wordprocessingDrawing" xmlns:w10="urn:schemas-microsoft-com:office:word" xmlns:w="http://schemas.openxmlformats.org/wordprocessingml/2006/main" xmlns:w14="http://schemas.microsoft.com/office/word/2010/wordml" xmlns:w15="http://schemas.microsoft.com/office/word/2012/wordml" xmlns:w16cex="http://schemas.microsoft.com/office/word/2018/wordml/cex" xmlns:w16cid="http://schemas.microsoft.com/office/word/2016/wordml/cid" xmlns:w16="http://schemas.microsoft.com/office/word/2018/wordml" xmlns:w16du="http://schemas.microsoft.com/office/word/2023/wordml/word16du" xmlns:w16sdtdh="http://schemas.microsoft.com/office/word/2020/wordml/sdtdatahash" xmlns:w16sdtfl="http://schemas.microsoft.com/office/word/2024/wordml/sdtformatlock" xmlns:w16se="http://schemas.microsoft.com/office/word/2015/wordml/symex" xmlns:wpg="http://schemas.microsoft.com/office/word/2010/wordprocessingGroup" xmlns:wpi="http://schemas.microsoft.com/office/word/2010/wordprocessingInk" xmlns:wne="http://schemas.microsoft.com/office/word/2006/wordml" xmlns:wps="http://schemas.microsoft.com/office/word/2010/wordprocessingShape" mc:Ignorable="w14 w15 w16se w16cid w16 w16cex w16sdtdh w16sdtfl w16du wp14">
+<w:document xmlns:wpc="http://schemas.microsoft.com/office/word/2010/wordprocessingCanvas" xmlns:cx="http://schemas.microsoft.com/office/drawing/2014/chartex" xmlns:cx1="http://schemas.microsoft.com/office/drawing/2015/9/8/chartex" xmlns:cx2="http://schemas.microsoft.com/office/drawing/2015/10/21/chartex" xmlns:cx3="http://schemas.microsoft.com/office/drawing/2016/5/9/chartex" xmlns:cx4="http://schemas.microsoft.com/office/drawing/2016/5/10/chartex" xmlns:cx5="http://schemas.microsoft.com/office/drawing/2016/5/11/chartex" xmlns:cx6="http://schemas.microsoft.com/office/drawing/2016/5/12/chartex" xmlns:cx7="http://schemas.microsoft.com/office/drawing/2016/5/13/chartex" xmlns:cx8="http://schemas.microsoft.com/office/drawing/2016/5/14/chartex" xmlns:mc="http://schemas.openxmlformats.org/markup-compatibility/2006" xmlns:m="http://schemas.openxmlformats.org/officeDocument/2006/math" xmlns:aink="http://schemas.microsoft.com/office/drawing/2016/ink" xmlns:am3d="http://schemas.microsoft.com/office/drawing/2017/model3d" xmlns:oel="http://schemas.microsoft.com/office/2019/extlst" xmlns:r="http://schemas.openxmlformats.org/officeDocument/2006/relationships" xmlns:wp14="http://schemas.microsoft.com/office/word/2010/wordprocessingDrawing" xmlns:wp="http://schemas.openxmlformats.org/drawingml/2006/wordprocessingDrawing" xmlns:wpg="http://schemas.microsoft.com/office/word/2010/wordprocessingGroup" xmlns:wpi="http://schemas.microsoft.com/office/word/2010/wordprocessingInk" xmlns:wps="http://schemas.microsoft.com/office/word/2010/wordprocessingShape" xmlns:o="urn:schemas-microsoft-com:office:office" xmlns:v="urn:schemas-microsoft-com:vml" xmlns:w10="urn:schemas-microsoft-com:office:word" xmlns:w="http://schemas.openxmlformats.org/wordprocessingml/2006/main" xmlns:w14="http://schemas.microsoft.com/office/word/2010/wordml" xmlns:w15="http://schemas.microsoft.com/office/word/2012/wordml" xmlns:w16cei="http://schemas.microsoft.com/office/word/2026/wordml/cei" xmlns:w16cex="http://schemas.microsoft.com/office/word/2018/wordml/cex" xmlns:w16cid="http://schemas.microsoft.com/office/word/2016/wordml/cid" xmlns:w16="http://schemas.microsoft.com/office/word/2018/wordml" xmlns:w16sdtdh="http://schemas.microsoft.com/office/word/2020/wordml/sdtdatahash" xmlns:w16sdtfl="http://schemas.microsoft.com/office/word/2024/wordml/sdtformatlock" xmlns:w16se="http://schemas.microsoft.com/office/word/2015/wordml/symex" xmlns:w16du="http://schemas.microsoft.com/office/word/2023/wordml/word16du" xmlns:wne="http://schemas.microsoft.com/office/word/2006/wordml" mc:Ignorable="w14 w15 w16se w16cid w16 w16cex w16sdtdh w16sdtfl w16du wp14">
   <w:body>
     <w:p>
       <w:pPr>
@@ -32,7 +32,10 @@
       </w:r>
       <w:proofErr w:type="spellStart"/>
       <w:r>
-        <w:t>simplePredict</w:t>
+        <w:t>simpl</w:t>
+      </w:r>
+      <w:r>
+        <w:t>eVerify</w:t>
       </w:r>
       <w:proofErr w:type="spellEnd"/>
       <w:r>
@@ -59,7 +62,10 @@
       </w:r>
       <w:proofErr w:type="spellStart"/>
       <w:r>
-        <w:t>simplePredict</w:t>
+        <w:t>simple</w:t>
+      </w:r>
+      <w:r>
+        <w:t>Verify</w:t>
       </w:r>
       <w:proofErr w:type="spellEnd"/>
       <w:r>
@@ -194,26 +200,16 @@
       <w:r>
         <w:t xml:space="preserve"> create a unique directory based on the sample name of the molecule. If a student had made aspirin as part of a </w:t>
       </w:r>
-      <w:proofErr w:type="gramStart"/>
-      <w:r>
-        <w:t>project</w:t>
-      </w:r>
-      <w:proofErr w:type="gramEnd"/>
+      <w:r>
+        <w:t>project,</w:t>
+      </w:r>
       <w:r>
         <w:t xml:space="preserve"> then the student should save the data in a directory called aspirin_1 for example.</w:t>
       </w:r>
     </w:p>
     <w:p>
       <w:r>
-        <w:t xml:space="preserve">The MNOVA file corresponding to this file should </w:t>
-      </w:r>
-      <w:proofErr w:type="spellStart"/>
-      <w:r>
-        <w:t>should</w:t>
-      </w:r>
-      <w:proofErr w:type="spellEnd"/>
-      <w:r>
-        <w:t xml:space="preserve"> be saved in this directory under the same name.</w:t>
+        <w:t>The MNOVA file corresponding to this file should be saved in this directory under the same name.</w:t>
       </w:r>
     </w:p>
     <w:p>
@@ -225,7 +221,7 @@
           <w:noProof/>
         </w:rPr>
         <w:drawing>
-          <wp:inline distT="0" distB="0" distL="0" distR="0" wp14:anchorId="15F16F62" wp14:editId="62069109">
+          <wp:inline distT="0" distB="0" distL="0" distR="0" wp14:anchorId="15F16F62" wp14:editId="407D64F7">
             <wp:extent cx="5731510" cy="1811655"/>
             <wp:effectExtent l="0" t="0" r="0" b="0"/>
             <wp:docPr id="394697433" name="Picture 2" descr="Directory structure and naming convention&#10;"/>
@@ -274,24 +270,14 @@
       <w:r>
         <w:t xml:space="preserve">Figure </w:t>
       </w:r>
-      <w:r>
-        <w:fldChar w:fldCharType="begin"/>
-      </w:r>
-      <w:r>
-        <w:instrText xml:space="preserve"> SEQ Figure \* ARABIC </w:instrText>
-      </w:r>
-      <w:r>
-        <w:fldChar w:fldCharType="separate"/>
-      </w:r>
-      <w:r>
-        <w:rPr>
-          <w:noProof/>
-        </w:rPr>
-        <w:t>1</w:t>
-      </w:r>
-      <w:r>
-        <w:fldChar w:fldCharType="end"/>
-      </w:r>
+      <w:fldSimple w:instr=" SEQ Figure \* ARABIC ">
+        <w:r>
+          <w:rPr>
+            <w:noProof/>
+          </w:rPr>
+          <w:t>1</w:t>
+        </w:r>
+      </w:fldSimple>
       <w:r>
         <w:t xml:space="preserve"> Directory structure and naming convention </w:t>
       </w:r>
@@ -357,19 +343,15 @@
       <w:r>
         <w:t xml:space="preserve">Process the data </w:t>
       </w:r>
-      <w:proofErr w:type="gramStart"/>
-      <w:r>
-        <w:t>so as to</w:t>
-      </w:r>
-      <w:proofErr w:type="gramEnd"/>
+      <w:r>
+        <w:t>to</w:t>
+      </w:r>
       <w:r>
         <w:t xml:space="preserve"> facilitate the accurate extraction of the required data.  For all spectra, ensure the use of zero filling before FT (at least a factor of two).  In the case of 2D spectra, the acquired data will typically be severely truncated in both dimensions.  So, </w:t>
       </w:r>
-      <w:proofErr w:type="gramStart"/>
-      <w:r>
-        <w:t>assuming that</w:t>
-      </w:r>
-      <w:proofErr w:type="gramEnd"/>
+      <w:r>
+        <w:t>if</w:t>
+      </w:r>
       <w:r>
         <w:t xml:space="preserve"> we have a reasonable S/N ratio, it is a good idea to double the number of data points acquired using forward linear prediction and then double the size of that using zero filling (in both dimensions).  This helps considerably with the accurate positioning of correlations.  Note, however, that large 2D datasets will considerably slow down the response of the processing software (how large depends to some extent on how much memory is present in the processing computer).  It is also worth considering whether the data has been acquired using compressive sensing (non-uniform sampling) in the indirect dimension.  If compressive sensing has been used and reconstruction has then yielded a large dataset in that dimension already (say 1k or greater), then linear prediction should probably not be applied.  For a more detailed discussion of this topic see Section 4 of “Minimizing the risk of deducing wrong natural product structures from NMR data”, D. C. Burns, W. F. Reynolds, </w:t>
       </w:r>
@@ -534,15 +516,7 @@
         <w:t>3</w:t>
       </w:r>
       <w:r>
-        <w:t xml:space="preserve">C spectrum and with the centre of the corresponding proton </w:t>
-      </w:r>
-      <w:proofErr w:type="spellStart"/>
-      <w:r>
-        <w:t>multiplet</w:t>
-      </w:r>
-      <w:proofErr w:type="spellEnd"/>
-      <w:r>
-        <w:t xml:space="preserve"> in the 1D-</w:t>
+        <w:t>C spectrum and with the centre of the corresponding proton multiplet in the 1D-</w:t>
       </w:r>
       <w:r>
         <w:rPr>
@@ -553,11 +527,9 @@
       <w:r>
         <w:t>H spectrum.  Note that this may not actually be on a local maximum in the 2D spectrum.  See the example in the figure below.  Click on the left mouse button to “peak pick” (</w:t>
       </w:r>
-      <w:proofErr w:type="spellStart"/>
-      <w:r>
-        <w:t>ie</w:t>
-      </w:r>
-      <w:proofErr w:type="spellEnd"/>
+      <w:r>
+        <w:t>i.e.</w:t>
+      </w:r>
       <w:r>
         <w:t xml:space="preserve"> define) that position.  Repeat the procedure for other correlations until you have picked all the required correlations.</w:t>
       </w:r>
@@ -587,11 +559,28 @@
       </w:r>
       <w:proofErr w:type="spellStart"/>
       <w:r>
-        <w:t>simplePredict</w:t>
+        <w:t>simple</w:t>
+      </w:r>
+      <w:r>
+        <w:t>Verify</w:t>
       </w:r>
       <w:proofErr w:type="spellEnd"/>
       <w:r>
-        <w:t xml:space="preserve"> tool makes no use of them so you are just wasting your time and it is potentially unhelpful.  Second, you need to set the threshold sensibly and may need to adjust it during the “picking” process.  Given the sensitivity of modern instruments, HMBC is often capable of detecting weak correlations over more than 3 bonds, which generally do not help greatly.  So how do you know if you have the threshold set correctly?  There is no hard and fast rule but if you are seeing an </w:t>
+        <w:t xml:space="preserve"> tool makes no use of </w:t>
+      </w:r>
+      <w:r>
+        <w:t>them,</w:t>
+      </w:r>
+      <w:r>
+        <w:t xml:space="preserve"> so you are just wasting your </w:t>
+      </w:r>
+      <w:proofErr w:type="gramStart"/>
+      <w:r>
+        <w:t>time</w:t>
+      </w:r>
+      <w:proofErr w:type="gramEnd"/>
+      <w:r>
+        <w:t xml:space="preserve"> and it is potentially unhelpful.  Second, you need to set the threshold sensibly and may need to adjust it during the “picking” process.  Given the sensitivity of modern instruments, HMBC is often capable of detecting weak correlations over more than 3 bonds, which generally do not help greatly.  So how do you know if you have the threshold set correctly?  There is no hard and fast rule but if you are seeing an </w:t>
       </w:r>
       <w:r>
         <w:rPr>
@@ -600,29 +589,11 @@
         <w:t>average</w:t>
       </w:r>
       <w:r>
-        <w:t xml:space="preserve"> of 2 or 3 correlations per carbon, that is probably plenty.  Don’t worry that you might be missing a correlation or two.  There is generally a lot of redundant information in the HMBC so you are unlikely to need them.  The converse of that is that if you have adjusted the threshold to suit a couple of methyl singlets in the proton spectrum of your molecule you are likely to be missing most of the correlations from highly-coupled CH </w:t>
-      </w:r>
-      <w:proofErr w:type="spellStart"/>
-      <w:r>
-        <w:t>multiplets</w:t>
-      </w:r>
-      <w:proofErr w:type="spellEnd"/>
-      <w:r>
-        <w:t xml:space="preserve"> elsewhere in the spectrum.  And if you set the threshold to suit the lowest intensity CH </w:t>
-      </w:r>
-      <w:proofErr w:type="spellStart"/>
-      <w:r>
-        <w:t>multiplet</w:t>
-      </w:r>
-      <w:proofErr w:type="spellEnd"/>
-      <w:r>
-        <w:t xml:space="preserve">, you may well see correlations over 4, 5, or even six bonds from a methyl singlet.  </w:t>
-      </w:r>
-      <w:proofErr w:type="gramStart"/>
-      <w:r>
-        <w:t>So</w:t>
-      </w:r>
-      <w:proofErr w:type="gramEnd"/>
+        <w:t xml:space="preserve"> of 2 or 3 correlations per carbon, that is probably plenty.  Don’t worry that you might be missing a correlation or two.  There is generally a lot of redundant information in the HMBC so you are unlikely to need them.  The converse of that is that if you have adjusted the threshold to suit a couple of methyl singlets in the proton spectrum of your molecule you are likely to be missing most of the correlations from highly-coupled CH multiplets elsewhere in the spectrum.  And if you set the threshold to suit the lowest intensity CH multiplet, you may well see correlations over 4, 5, or even six bonds from a methyl singlet.  </w:t>
+      </w:r>
+      <w:r>
+        <w:t>So,</w:t>
+      </w:r>
       <w:r>
         <w:t xml:space="preserve"> you may need to pick a sensible number of correlations from the methyl signals first, then turn up the intensity so that you can see correlations from other signals.  </w:t>
       </w:r>
@@ -697,24 +668,14 @@
       <w:r>
         <w:t xml:space="preserve">Figure </w:t>
       </w:r>
-      <w:r>
-        <w:fldChar w:fldCharType="begin"/>
-      </w:r>
-      <w:r>
-        <w:instrText xml:space="preserve"> SEQ Figure \* ARABIC </w:instrText>
-      </w:r>
-      <w:r>
-        <w:fldChar w:fldCharType="separate"/>
-      </w:r>
-      <w:r>
-        <w:rPr>
-          <w:noProof/>
-        </w:rPr>
-        <w:t>2</w:t>
-      </w:r>
-      <w:r>
-        <w:fldChar w:fldCharType="end"/>
-      </w:r>
+      <w:fldSimple w:instr=" SEQ Figure \* ARABIC ">
+        <w:r>
+          <w:rPr>
+            <w:noProof/>
+          </w:rPr>
+          <w:t>2</w:t>
+        </w:r>
+      </w:fldSimple>
       <w:r>
         <w:t xml:space="preserve"> 2-D peak picking showing peak position between centre of </w:t>
       </w:r>
@@ -736,7 +697,10 @@
       </w:r>
       <w:proofErr w:type="spellStart"/>
       <w:r>
-        <w:t>simplePredict</w:t>
+        <w:t>simple</w:t>
+      </w:r>
+      <w:r>
+        <w:t>Verify</w:t>
       </w:r>
       <w:proofErr w:type="spellEnd"/>
       <w:r>
@@ -744,7 +708,10 @@
       </w:r>
       <w:proofErr w:type="spellStart"/>
       <w:r>
-        <w:t>simplePredict</w:t>
+        <w:t>simple</w:t>
+      </w:r>
+      <w:r>
+        <w:t>Verify</w:t>
       </w:r>
       <w:proofErr w:type="spellEnd"/>
       <w:r>
@@ -790,15 +757,7 @@
       </w:r>
       <w:proofErr w:type="spellEnd"/>
       <w:r>
-        <w:t xml:space="preserve"> tool, pick positions that align with the centres of the corresponding proton </w:t>
-      </w:r>
-      <w:proofErr w:type="spellStart"/>
-      <w:r>
-        <w:t>multiplets</w:t>
-      </w:r>
-      <w:proofErr w:type="spellEnd"/>
-      <w:r>
-        <w:t xml:space="preserve"> in the 1D-</w:t>
+        <w:t xml:space="preserve"> tool, pick positions that align with the centres of the corresponding proton multiplets in the 1D-</w:t>
       </w:r>
       <w:r>
         <w:rPr>
@@ -809,11 +768,9 @@
       <w:r>
         <w:t xml:space="preserve">H spectrum and leave out any correlations where you cannot be sure what is correlating to what (again, only a problem where you have significant peak overlap).  You do not need to pick peaks that lie on the diagonal (they contain no information) and if you pick a correlation on one side of the diagonal you do not need to pick the symmetric peak on the other side of the diagonal.  </w:t>
       </w:r>
-      <w:proofErr w:type="gramStart"/>
-      <w:r>
-        <w:t>So</w:t>
-      </w:r>
-      <w:proofErr w:type="gramEnd"/>
+      <w:r>
+        <w:t>So,</w:t>
+      </w:r>
       <w:r>
         <w:t xml:space="preserve"> the number of peaks you pick will be only a fraction of the peaks visible in the </w:t>
       </w:r>
@@ -880,24 +837,14 @@
       <w:r>
         <w:t xml:space="preserve">Figure </w:t>
       </w:r>
-      <w:r>
-        <w:fldChar w:fldCharType="begin"/>
-      </w:r>
-      <w:r>
-        <w:instrText xml:space="preserve"> SEQ Figure \* ARABIC </w:instrText>
-      </w:r>
-      <w:r>
-        <w:fldChar w:fldCharType="separate"/>
-      </w:r>
-      <w:r>
-        <w:rPr>
-          <w:noProof/>
-        </w:rPr>
-        <w:t>3</w:t>
-      </w:r>
-      <w:r>
-        <w:fldChar w:fldCharType="end"/>
-      </w:r>
+      <w:fldSimple w:instr=" SEQ Figure \* ARABIC ">
+        <w:r>
+          <w:rPr>
+            <w:noProof/>
+          </w:rPr>
+          <w:t>3</w:t>
+        </w:r>
+      </w:fldSimple>
       <w:r>
         <w:t xml:space="preserve"> COSY 2D peak picking showing that position of </w:t>
       </w:r>
@@ -917,7 +864,7 @@
 </file>
 
 <file path=word/numbering.xml><?xml version="1.0" encoding="utf-8"?>
-<w:numbering xmlns:wpc="http://schemas.microsoft.com/office/word/2010/wordprocessingCanvas" xmlns:cx="http://schemas.microsoft.com/office/drawing/2014/chartex" xmlns:cx1="http://schemas.microsoft.com/office/drawing/2015/9/8/chartex" xmlns:cx2="http://schemas.microsoft.com/office/drawing/2015/10/21/chartex" xmlns:cx3="http://schemas.microsoft.com/office/drawing/2016/5/9/chartex" xmlns:cx4="http://schemas.microsoft.com/office/drawing/2016/5/10/chartex" xmlns:cx5="http://schemas.microsoft.com/office/drawing/2016/5/11/chartex" xmlns:cx6="http://schemas.microsoft.com/office/drawing/2016/5/12/chartex" xmlns:cx7="http://schemas.microsoft.com/office/drawing/2016/5/13/chartex" xmlns:cx8="http://schemas.microsoft.com/office/drawing/2016/5/14/chartex" xmlns:mc="http://schemas.openxmlformats.org/markup-compatibility/2006" xmlns:aink="http://schemas.microsoft.com/office/drawing/2016/ink" xmlns:am3d="http://schemas.microsoft.com/office/drawing/2017/model3d" xmlns:o="urn:schemas-microsoft-com:office:office" xmlns:oel="http://schemas.microsoft.com/office/2019/extlst" xmlns:r="http://schemas.openxmlformats.org/officeDocument/2006/relationships" xmlns:m="http://schemas.openxmlformats.org/officeDocument/2006/math" xmlns:v="urn:schemas-microsoft-com:vml" xmlns:wp14="http://schemas.microsoft.com/office/word/2010/wordprocessingDrawing" xmlns:wp="http://schemas.openxmlformats.org/drawingml/2006/wordprocessingDrawing" xmlns:w10="urn:schemas-microsoft-com:office:word" xmlns:w="http://schemas.openxmlformats.org/wordprocessingml/2006/main" xmlns:w14="http://schemas.microsoft.com/office/word/2010/wordml" xmlns:w15="http://schemas.microsoft.com/office/word/2012/wordml" xmlns:w16cex="http://schemas.microsoft.com/office/word/2018/wordml/cex" xmlns:w16cid="http://schemas.microsoft.com/office/word/2016/wordml/cid" xmlns:w16="http://schemas.microsoft.com/office/word/2018/wordml" xmlns:w16du="http://schemas.microsoft.com/office/word/2023/wordml/word16du" xmlns:w16sdtdh="http://schemas.microsoft.com/office/word/2020/wordml/sdtdatahash" xmlns:w16sdtfl="http://schemas.microsoft.com/office/word/2024/wordml/sdtformatlock" xmlns:w16se="http://schemas.microsoft.com/office/word/2015/wordml/symex" xmlns:wpg="http://schemas.microsoft.com/office/word/2010/wordprocessingGroup" xmlns:wpi="http://schemas.microsoft.com/office/word/2010/wordprocessingInk" xmlns:wne="http://schemas.microsoft.com/office/word/2006/wordml" xmlns:wps="http://schemas.microsoft.com/office/word/2010/wordprocessingShape" mc:Ignorable="w14 w15 w16se w16cid w16 w16cex w16sdtdh w16sdtfl w16du wp14">
+<w:numbering xmlns:wpc="http://schemas.microsoft.com/office/word/2010/wordprocessingCanvas" xmlns:cx="http://schemas.microsoft.com/office/drawing/2014/chartex" xmlns:cx1="http://schemas.microsoft.com/office/drawing/2015/9/8/chartex" xmlns:cx2="http://schemas.microsoft.com/office/drawing/2015/10/21/chartex" xmlns:cx3="http://schemas.microsoft.com/office/drawing/2016/5/9/chartex" xmlns:cx4="http://schemas.microsoft.com/office/drawing/2016/5/10/chartex" xmlns:cx5="http://schemas.microsoft.com/office/drawing/2016/5/11/chartex" xmlns:cx6="http://schemas.microsoft.com/office/drawing/2016/5/12/chartex" xmlns:cx7="http://schemas.microsoft.com/office/drawing/2016/5/13/chartex" xmlns:cx8="http://schemas.microsoft.com/office/drawing/2016/5/14/chartex" xmlns:mc="http://schemas.openxmlformats.org/markup-compatibility/2006" xmlns:m="http://schemas.openxmlformats.org/officeDocument/2006/math" xmlns:aink="http://schemas.microsoft.com/office/drawing/2016/ink" xmlns:am3d="http://schemas.microsoft.com/office/drawing/2017/model3d" xmlns:oel="http://schemas.microsoft.com/office/2019/extlst" xmlns:r="http://schemas.openxmlformats.org/officeDocument/2006/relationships" xmlns:wp14="http://schemas.microsoft.com/office/word/2010/wordprocessingDrawing" xmlns:wp="http://schemas.openxmlformats.org/drawingml/2006/wordprocessingDrawing" xmlns:wpg="http://schemas.microsoft.com/office/word/2010/wordprocessingGroup" xmlns:wpi="http://schemas.microsoft.com/office/word/2010/wordprocessingInk" xmlns:wps="http://schemas.microsoft.com/office/word/2010/wordprocessingShape" xmlns:o="urn:schemas-microsoft-com:office:office" xmlns:v="urn:schemas-microsoft-com:vml" xmlns:w10="urn:schemas-microsoft-com:office:word" xmlns:w="http://schemas.openxmlformats.org/wordprocessingml/2006/main" xmlns:w14="http://schemas.microsoft.com/office/word/2010/wordml" xmlns:w15="http://schemas.microsoft.com/office/word/2012/wordml" xmlns:w16cei="http://schemas.microsoft.com/office/word/2026/wordml/cei" xmlns:w16cex="http://schemas.microsoft.com/office/word/2018/wordml/cex" xmlns:w16cid="http://schemas.microsoft.com/office/word/2016/wordml/cid" xmlns:w16="http://schemas.microsoft.com/office/word/2018/wordml" xmlns:w16sdtdh="http://schemas.microsoft.com/office/word/2020/wordml/sdtdatahash" xmlns:w16sdtfl="http://schemas.microsoft.com/office/word/2024/wordml/sdtformatlock" xmlns:w16se="http://schemas.microsoft.com/office/word/2015/wordml/symex" xmlns:w16du="http://schemas.microsoft.com/office/word/2023/wordml/word16du" xmlns:wne="http://schemas.microsoft.com/office/word/2006/wordml" mc:Ignorable="w14 w15 w16se w16cid w16 w16cex w16sdtdh w16sdtfl w16du wp14">
   <w:abstractNum w:abstractNumId="0" w15:restartNumberingAfterBreak="0">
     <w:nsid w:val="29CD654C"/>
     <w:multiLevelType w:val="hybridMultilevel"/>
@@ -1014,7 +961,7 @@
 </file>
 
 <file path=word/styles.xml><?xml version="1.0" encoding="utf-8"?>
-<w:styles xmlns:mc="http://schemas.openxmlformats.org/markup-compatibility/2006" xmlns:r="http://schemas.openxmlformats.org/officeDocument/2006/relationships" xmlns:w="http://schemas.openxmlformats.org/wordprocessingml/2006/main" xmlns:w14="http://schemas.microsoft.com/office/word/2010/wordml" xmlns:w15="http://schemas.microsoft.com/office/word/2012/wordml" xmlns:w16cex="http://schemas.microsoft.com/office/word/2018/wordml/cex" xmlns:w16cid="http://schemas.microsoft.com/office/word/2016/wordml/cid" xmlns:w16="http://schemas.microsoft.com/office/word/2018/wordml" xmlns:w16du="http://schemas.microsoft.com/office/word/2023/wordml/word16du" xmlns:w16sdtdh="http://schemas.microsoft.com/office/word/2020/wordml/sdtdatahash" xmlns:w16sdtfl="http://schemas.microsoft.com/office/word/2024/wordml/sdtformatlock" xmlns:w16se="http://schemas.microsoft.com/office/word/2015/wordml/symex" mc:Ignorable="w14 w15 w16se w16cid w16 w16cex w16sdtdh w16sdtfl w16du">
+<w:styles xmlns:mc="http://schemas.openxmlformats.org/markup-compatibility/2006" xmlns:r="http://schemas.openxmlformats.org/officeDocument/2006/relationships" xmlns:w="http://schemas.openxmlformats.org/wordprocessingml/2006/main" xmlns:w14="http://schemas.microsoft.com/office/word/2010/wordml" xmlns:w15="http://schemas.microsoft.com/office/word/2012/wordml" xmlns:w16cex="http://schemas.microsoft.com/office/word/2018/wordml/cex" xmlns:w16cid="http://schemas.microsoft.com/office/word/2016/wordml/cid" xmlns:w16="http://schemas.microsoft.com/office/word/2018/wordml" xmlns:w16sdtdh="http://schemas.microsoft.com/office/word/2020/wordml/sdtdatahash" xmlns:w16sdtfl="http://schemas.microsoft.com/office/word/2024/wordml/sdtformatlock" xmlns:w16se="http://schemas.microsoft.com/office/word/2015/wordml/symex" xmlns:w16du="http://schemas.microsoft.com/office/word/2023/wordml/word16du" mc:Ignorable="w14 w15 w16se w16cid w16 w16cex w16sdtdh w16sdtfl w16du">
   <w:docDefaults>
     <w:rPrDefault>
       <w:rPr>

</xml_diff>